<commit_message>
Update CTA captions with 6-week beta / bet-on-yourself refund offer
</commit_message>
<xml_diff>
--- a/content/Muscle-Guard-Hooks-and-Captions.docx
+++ b/content/Muscle-Guard-Hooks-and-Captions.docx
@@ -3783,7 +3783,7 @@
           <w:sz w:val="20"/>
           <w:szCs w:val="20"/>
         </w:rPr>
-        <w:t xml:space="preserve">That's exactly what Muscle Guard is — a protein target, a simple resistance training structure, and monitoring built specifically for people losing weight on a GLP-1. Comment MUSCLE and I'll send you the details.</w:t>
+        <w:t xml:space="preserve">That's Muscle Guard — a 6-week beta round with a protein target and a simple resistance training structure, built specifically for people losing weight on a GLP-1. Complete the workouts and the nutrition, and you get every dollar back — this round is about proving it works, not about the money. Comment MUSCLE for details.</w:t>
       </w:r>
     </w:p>
     <w:p>
@@ -3824,7 +3824,7 @@
           <w:sz w:val="20"/>
           <w:szCs w:val="20"/>
         </w:rPr>
-        <w:t xml:space="preserve">Based on the research, likely a more toned outcome instead of a "smaller" one, and a stronger metabolic foundation once you reach maintenance. That's the difference Muscle Guard is designed to make.</w:t>
+        <w:t xml:space="preserve">Based on the research, likely a more toned outcome instead of a "smaller" one. That's exactly what the 6-week Muscle Guard beta is built to prove — and if you complete the workouts and nutrition, you get a full refund regardless of where the scale lands. I need real results and real case studies more than I need your money right now.</w:t>
       </w:r>
     </w:p>
     <w:p>
@@ -3865,7 +3865,7 @@
           <w:sz w:val="20"/>
           <w:szCs w:val="20"/>
         </w:rPr>
-        <w:t xml:space="preserve">No judgment either way — most people just weren't given a plan for this part. If you want one, that's what Muscle Guard is for. Comment MUSCLE and I'll walk you through it.</w:t>
+        <w:t xml:space="preserve">No judgment — most people just weren't given a plan for this part. Muscle Guard is a 6-week beta built to be that plan, and it's structured so you're betting on yourself: complete the workouts and nutrition, get every penny back. Comment MUSCLE and I'll walk you through it.</w:t>
       </w:r>
     </w:p>
     <w:p>
@@ -3906,7 +3906,7 @@
           <w:sz w:val="20"/>
           <w:szCs w:val="20"/>
         </w:rPr>
-        <w:t xml:space="preserve">If the honest answer is "I don't really have one," you're not alone — and that's the exact gap Muscle Guard fills: a protein target and training structure built around your GLP-1 journey.</w:t>
+        <w:t xml:space="preserve">If the honest answer is "I don't really have one," the 6-week Muscle Guard beta is built to be that plan — protein target, training structure, check-ins. Complete the workouts and nutrition and it's on me: full refund. This round is about case studies, not profit.</w:t>
       </w:r>
     </w:p>
     <w:p>
@@ -3947,7 +3947,7 @@
           <w:sz w:val="20"/>
           <w:szCs w:val="20"/>
         </w:rPr>
-        <w:t xml:space="preserve">If it's just the injection right now, adding the other two pieces is where the real difference happens. Muscle Guard is built to be the simple, doable version of that — not a second full-time job.</w:t>
+        <w:t xml:space="preserve">If it's just the injection right now, the 6-week Muscle Guard beta adds the other two pieces. Complete the workouts and the nutrition side of it, and you get every dollar back — you're betting on yourself, and I'm backing that bet.</w:t>
       </w:r>
     </w:p>
     <w:p>
@@ -3988,7 +3988,7 @@
           <w:sz w:val="20"/>
           <w:szCs w:val="20"/>
         </w:rPr>
-        <w:t xml:space="preserve">It looks like your GLP-1 doing what it does, with a protein target and consistent resistance training running alongside it. That combination is the entire foundation of Muscle Guard.</w:t>
+        <w:t xml:space="preserve">That's the exact outcome the 6-week Muscle Guard beta is built to test. Complete the workouts and nutrition, and you get a full refund either way — I'd rather have your result and your story right now than your money.</w:t>
       </w:r>
     </w:p>
     <w:p>
@@ -4029,7 +4029,7 @@
           <w:sz w:val="20"/>
           <w:szCs w:val="20"/>
         </w:rPr>
-        <w:t xml:space="preserve">Most default GLP-1 plans are built around the second one only. Muscle Guard adds the first piece back in — so weight loss and muscle protection are happening at the same time, not one instead of the other.</w:t>
+        <w:t xml:space="preserve">Most default GLP-1 plans are built around the second one only. The 6-week Muscle Guard beta adds the first piece back in — and because getting people real results matters more right now than making money, completing the workouts and nutrition gets you every dollar back.</w:t>
       </w:r>
     </w:p>
     <w:p>
@@ -4070,7 +4070,7 @@
           <w:sz w:val="20"/>
           <w:szCs w:val="20"/>
         </w:rPr>
-        <w:t xml:space="preserve">The part that determines whether you end up looking "toned" or "deflated" at the finish line. If that's not being addressed, it's worth adding — and that's exactly what Muscle Guard was built for.</w:t>
+        <w:t xml:space="preserve">A structured plan for it — which is what the 6-week Muscle Guard beta is. Complete the workouts and the nutrition, and every penny comes back to you. This round is about building proof this works, not collecting payments.</w:t>
       </w:r>
     </w:p>
     <w:p>
@@ -4111,7 +4111,7 @@
           <w:sz w:val="20"/>
           <w:szCs w:val="20"/>
         </w:rPr>
-        <w:t xml:space="preserve">You don't actually have to choose — GLP-1s handle the pace, Muscle Guard handles the protection. They're built to work together, not compete with each other.</w:t>
+        <w:t xml:space="preserve">You don't have to choose — that's the whole premise of the 6-week Muscle Guard beta. And because I need real case studies more than I need your money right now, completing the workouts and nutrition gets you a full refund either way.</w:t>
       </w:r>
     </w:p>
     <w:p>
@@ -4152,7 +4152,7 @@
           <w:sz w:val="20"/>
           <w:szCs w:val="20"/>
         </w:rPr>
-        <w:t xml:space="preserve">Tell me in the comments — mine includes a personalized protein target, a simple 2-3x/week strength structure, and check-ins so you're not guessing. If that sounds like what you need, comment MUSCLE.</w:t>
+        <w:t xml:space="preserve">Tell me in the comments — the 6-week beta round includes a personalized protein target, a simple strength structure, and check-ins. Complete the workouts and nutrition and you get every dollar back. Comment MUSCLE if that's what you need.</w:t>
       </w:r>
     </w:p>
     <w:p>
@@ -4193,7 +4193,7 @@
           <w:sz w:val="20"/>
           <w:szCs w:val="20"/>
         </w:rPr>
-        <w:t xml:space="preserve">If yes, the missing piece is almost always protein and resistance training running alongside your GLP-1 — which is exactly what Muscle Guard is structured around. Comment MUSCLE and let's get you set up.</w:t>
+        <w:t xml:space="preserve">The 6-week Muscle Guard beta is built for exactly that, and it's structured so you're betting on yourself: complete the workouts and nutrition, and you get a full refund. Comment MUSCLE and let's get you in.</w:t>
       </w:r>
     </w:p>
     <w:p>
@@ -4234,7 +4234,7 @@
           <w:sz w:val="20"/>
           <w:szCs w:val="20"/>
         </w:rPr>
-        <w:t xml:space="preserve">Usually, it's knowing the "after" will look toned, not just smaller. That confidence comes from protecting your muscle the whole way through — which is the entire reason Muscle Guard exists.</w:t>
+        <w:t xml:space="preserve">A real plan and real accountability — which is what the 6-week Muscle Guard beta is built around. Complete the workouts and the nutrition, and every dollar comes back to you. This round isn't about the money, it's about proving this works.</w:t>
       </w:r>
     </w:p>
     <w:sectPr>

</xml_diff>

<commit_message>
Align CTA keyword to PROTECT to match live profile
</commit_message>
<xml_diff>
--- a/content/Muscle-Guard-Hooks-and-Captions.docx
+++ b/content/Muscle-Guard-Hooks-and-Captions.docx
@@ -3783,7 +3783,7 @@
           <w:sz w:val="20"/>
           <w:szCs w:val="20"/>
         </w:rPr>
-        <w:t xml:space="preserve">That's Muscle Guard — a 6-week beta round with a protein target and a simple resistance training structure, built specifically for people losing weight on a GLP-1. Complete the workouts and the nutrition, and you get every dollar back — this round is about proving it works, not about the money. Comment MUSCLE for details.</w:t>
+        <w:t xml:space="preserve">That's Muscle Guard — a 6-week beta round with a protein target and a simple resistance training structure, built specifically for people losing weight on a GLP-1. Complete the workouts and the nutrition, and you get every dollar back — this round is about proving it works, not about the money. Comment PROTECT for details.</w:t>
       </w:r>
     </w:p>
     <w:p>
@@ -3865,7 +3865,7 @@
           <w:sz w:val="20"/>
           <w:szCs w:val="20"/>
         </w:rPr>
-        <w:t xml:space="preserve">No judgment — most people just weren't given a plan for this part. Muscle Guard is a 6-week beta built to be that plan, and it's structured so you're betting on yourself: complete the workouts and nutrition, get every penny back. Comment MUSCLE and I'll walk you through it.</w:t>
+        <w:t xml:space="preserve">No judgment — most people just weren't given a plan for this part. Muscle Guard is a 6-week beta built to be that plan, and it's structured so you're betting on yourself: complete the workouts and nutrition, get every penny back. Comment PROTECT and I'll walk you through it.</w:t>
       </w:r>
     </w:p>
     <w:p>
@@ -4152,7 +4152,7 @@
           <w:sz w:val="20"/>
           <w:szCs w:val="20"/>
         </w:rPr>
-        <w:t xml:space="preserve">Tell me in the comments — the 6-week beta round includes a personalized protein target, a simple strength structure, and check-ins. Complete the workouts and nutrition and you get every dollar back. Comment MUSCLE if that's what you need.</w:t>
+        <w:t xml:space="preserve">Tell me in the comments — the 6-week beta round includes a personalized protein target, a simple strength structure, and check-ins. Complete the workouts and nutrition and you get every dollar back. Comment PROTECT if that's what you need.</w:t>
       </w:r>
     </w:p>
     <w:p>
@@ -4193,7 +4193,7 @@
           <w:sz w:val="20"/>
           <w:szCs w:val="20"/>
         </w:rPr>
-        <w:t xml:space="preserve">The 6-week Muscle Guard beta is built for exactly that, and it's structured so you're betting on yourself: complete the workouts and nutrition, and you get a full refund. Comment MUSCLE and let's get you in.</w:t>
+        <w:t xml:space="preserve">The 6-week Muscle Guard beta is built for exactly that, and it's structured so you're betting on yourself: complete the workouts and nutrition, and you get a full refund. Comment PROTECT and let's get you in.</w:t>
       </w:r>
     </w:p>
     <w:p>

</xml_diff>